<commit_message>
vault backup: 2026-07-16 09:39:02
</commit_message>
<xml_diff>
--- a/03 - Clients/Active Cooking Clients/Macrofood/UAT/16Jul26 Macrofrozen MAIA UAT Signoff Checklist.docx
+++ b/03 - Clients/Active Cooking Clients/Macrofood/UAT/16Jul26 Macrofrozen MAIA UAT Signoff Checklist.docx
@@ -12,52 +12,18 @@
       </w:r>
     </w:p>
     <w:bookmarkEnd w:id="9"/>
-    <w:bookmarkStart w:id="18" w:name="X22a3b33b58326ca3a95e0eac2fcc530dc0113ff"/>
+    <w:bookmarkStart w:id="18" w:name="maia-uat-acceptance-sign-off-checklist"/>
     <w:p>
       <w:pPr>
         <w:pStyle w:val="Heading1"/>
       </w:pPr>
       <w:r>
-        <w:t xml:space="preserve">MAIA — UAT Acceptance &amp; Sign-Off Checklist (1st UAT — Partial Sign-Off)</w:t>
+        <w:t xml:space="preserve">MAIA — UAT Acceptance &amp; Sign-Off Checklist</w:t>
       </w:r>
     </w:p>
     <w:p>
       <w:pPr>
         <w:pStyle w:val="FirstParagraph"/>
-      </w:pPr>
-      <w:r>
-        <w:rPr>
-          <w:b/>
-          <w:bCs/>
-        </w:rPr>
-        <w:t xml:space="preserve">This is the 1st UAT session and a partial sign-off only.</w:t>
-      </w:r>
-      <w:r>
-        <w:t xml:space="preserve"> </w:t>
-      </w:r>
-      <w:r>
-        <w:t xml:space="preserve">Not all capabilities in Section 4 are expected to be demonstrable this round — items not covered or not passed here are carried forward to a</w:t>
-      </w:r>
-      <w:r>
-        <w:t xml:space="preserve"> </w:t>
-      </w:r>
-      <w:r>
-        <w:rPr>
-          <w:b/>
-          <w:bCs/>
-        </w:rPr>
-        <w:t xml:space="preserve">2nd UAT session</w:t>
-      </w:r>
-      <w:r>
-        <w:t xml:space="preserve"> </w:t>
-      </w:r>
-      <w:r>
-        <w:t xml:space="preserve">scheduled after outstanding fixes/configuration are completed. Full acceptance under Section 7 is only achieved once both UAT rounds are signed off.</w:t>
-      </w:r>
-    </w:p>
-    <w:p>
-      <w:pPr>
-        <w:pStyle w:val="BodyText"/>
       </w:pPr>
       <w:r>
         <w:rPr>
@@ -2104,6 +2070,139 @@
           </w:p>
         </w:tc>
       </w:tr>
+      <w:tr>
+        <w:tc>
+          <w:tcPr/>
+          <w:p>
+            <w:pPr>
+              <w:pStyle w:val="Compact"/>
+            </w:pPr>
+            <w:r>
+              <w:rPr>
+                <w:b/>
+                <w:bCs/>
+              </w:rPr>
+              <w:t xml:space="preserve">H. Billing &amp; Payment Support</w:t>
+            </w:r>
+          </w:p>
+        </w:tc>
+        <w:tc>
+          <w:tcPr/>
+          <w:p>
+            <w:pPr>
+              <w:pStyle w:val="Compact"/>
+            </w:pPr>
+          </w:p>
+        </w:tc>
+        <w:tc>
+          <w:tcPr/>
+          <w:p>
+            <w:pPr>
+              <w:pStyle w:val="Compact"/>
+            </w:pPr>
+          </w:p>
+        </w:tc>
+        <w:tc>
+          <w:tcPr/>
+          <w:p>
+            <w:pPr>
+              <w:pStyle w:val="Compact"/>
+            </w:pPr>
+          </w:p>
+        </w:tc>
+      </w:tr>
+      <w:tr>
+        <w:tc>
+          <w:tcPr/>
+          <w:p>
+            <w:pPr>
+              <w:pStyle w:val="Compact"/>
+            </w:pPr>
+            <w:r>
+              <w:t xml:space="preserve">22</w:t>
+            </w:r>
+          </w:p>
+        </w:tc>
+        <w:tc>
+          <w:tcPr/>
+          <w:p>
+            <w:pPr>
+              <w:pStyle w:val="Compact"/>
+            </w:pPr>
+            <w:r>
+              <w:t xml:space="preserve">Payment matching</w:t>
+            </w:r>
+          </w:p>
+        </w:tc>
+        <w:tc>
+          <w:tcPr/>
+          <w:p>
+            <w:pPr>
+              <w:pStyle w:val="Compact"/>
+            </w:pPr>
+            <w:r>
+              <w:t xml:space="preserve">A clean payment (matching payer name and amount) auto-matches to the correct invoice; a mismatched-payer-name payment is flagged for Finance’s manual confirmation, never silently matched.</w:t>
+            </w:r>
+          </w:p>
+        </w:tc>
+        <w:tc>
+          <w:tcPr/>
+          <w:p>
+            <w:pPr>
+              <w:pStyle w:val="Compact"/>
+            </w:pPr>
+            <w:r>
+              <w:t xml:space="preserve">Pass / Fail</w:t>
+            </w:r>
+          </w:p>
+        </w:tc>
+      </w:tr>
+      <w:tr>
+        <w:tc>
+          <w:tcPr/>
+          <w:p>
+            <w:pPr>
+              <w:pStyle w:val="Compact"/>
+            </w:pPr>
+            <w:r>
+              <w:t xml:space="preserve">23</w:t>
+            </w:r>
+          </w:p>
+        </w:tc>
+        <w:tc>
+          <w:tcPr/>
+          <w:p>
+            <w:pPr>
+              <w:pStyle w:val="Compact"/>
+            </w:pPr>
+            <w:r>
+              <w:t xml:space="preserve">Confirmation before posting</w:t>
+            </w:r>
+          </w:p>
+        </w:tc>
+        <w:tc>
+          <w:tcPr/>
+          <w:p>
+            <w:pPr>
+              <w:pStyle w:val="Compact"/>
+            </w:pPr>
+            <w:r>
+              <w:t xml:space="preserve">No record (price, credit, stock, or payment match) posts without explicit human confirmation.</w:t>
+            </w:r>
+          </w:p>
+        </w:tc>
+        <w:tc>
+          <w:tcPr/>
+          <w:p>
+            <w:pPr>
+              <w:pStyle w:val="Compact"/>
+            </w:pPr>
+            <w:r>
+              <w:t xml:space="preserve">Pass / Fail</w:t>
+            </w:r>
+          </w:p>
+        </w:tc>
+      </w:tr>
     </w:tbl>
     <w:p>
       <w:r>
@@ -2273,6 +2372,30 @@
             </w:pPr>
             <w:r>
               <w:t xml:space="preserve">Sales territory isolation (customer→agent assignment, rep-to-rep visibility) is enforced correctly</w:t>
+            </w:r>
+          </w:p>
+        </w:tc>
+        <w:tc>
+          <w:tcPr/>
+          <w:p>
+            <w:pPr>
+              <w:pStyle w:val="Compact"/>
+            </w:pPr>
+            <w:r>
+              <w:t xml:space="preserve">Pass / Fail</w:t>
+            </w:r>
+          </w:p>
+        </w:tc>
+      </w:tr>
+      <w:tr>
+        <w:tc>
+          <w:tcPr/>
+          <w:p>
+            <w:pPr>
+              <w:pStyle w:val="Compact"/>
+            </w:pPr>
+            <w:r>
+              <w:t xml:space="preserve">Payment matching flags ambiguous cases for Finance rather than silently matching</w:t>
             </w:r>
           </w:p>
         </w:tc>
@@ -2660,13 +2783,13 @@
       </w:r>
     </w:p>
     <w:bookmarkEnd w:id="15"/>
-    <w:bookmarkStart w:id="16" w:name="acceptance-declaration-1st-uat-partial"/>
+    <w:bookmarkStart w:id="16" w:name="acceptance-declaration"/>
     <w:p>
       <w:pPr>
         <w:pStyle w:val="Heading2"/>
       </w:pPr>
       <w:r>
-        <w:t xml:space="preserve">7. Acceptance Declaration (1st UAT — Partial)</w:t>
+        <w:t xml:space="preserve">7. Acceptance Declaration</w:t>
       </w:r>
     </w:p>
     <w:p>
@@ -2684,7 +2807,7 @@
         <w:t xml:space="preserve"> </w:t>
       </w:r>
       <w:r>
-        <w:t xml:space="preserve">By signing this checklist, Macro Frozen Sdn. Bhd. confirms that the MAIA implementation has been demonstrated and reviewed, for the items covered in this 1st UAT session, against the scope in Section 2 and the criteria in Sections 4 and 5.</w:t>
+        <w:t xml:space="preserve">By signing this checklist, Macro Frozen Sdn. Bhd. confirms that the MAIA implementation has been demonstrated and reviewed against the scope in Section 2 and the criteria in Sections 4 and 5.</w:t>
       </w:r>
     </w:p>
     <w:p>
@@ -2702,23 +2825,7 @@
         <w:t xml:space="preserve"> </w:t>
       </w:r>
       <w:r>
-        <w:t xml:space="preserve">Items marked Pass are accepted as meeting the relevant expectation. Items marked Fail, or not yet demonstrated this round, are carried forward to the</w:t>
-      </w:r>
-      <w:r>
-        <w:t xml:space="preserve"> </w:t>
-      </w:r>
-      <w:r>
-        <w:rPr>
-          <w:b/>
-          <w:bCs/>
-        </w:rPr>
-        <w:t xml:space="preserve">2nd UAT session</w:t>
-      </w:r>
-      <w:r>
-        <w:t xml:space="preserve"> </w:t>
-      </w:r>
-      <w:r>
-        <w:t xml:space="preserve">as open, deferred or retest items, unless both parties agree in writing to exclude them.</w:t>
+        <w:t xml:space="preserve">Items marked Pass are accepted as meeting the relevant expectation. Items marked Fail are recorded as open, deferred or retest items before final operational acceptance, unless both parties agree in writing to exclude them.</w:t>
       </w:r>
     </w:p>
     <w:p>
@@ -2736,20 +2843,7 @@
         <w:t xml:space="preserve"> </w:t>
       </w:r>
       <w:r>
-        <w:t xml:space="preserve">This 1st UAT session is a</w:t>
-      </w:r>
-      <w:r>
-        <w:t xml:space="preserve"> </w:t>
-      </w:r>
-      <w:r>
-        <w:rPr>
-          <w:b/>
-          <w:bCs/>
-        </w:rPr>
-        <w:t xml:space="preserve">partial sign-off</w:t>
-      </w:r>
-      <w:r>
-        <w:t xml:space="preserve">. The UAT acceptance milestone under the signed proposal is treated as achieved only once all Section 4 items are marked Pass across this 1st session and the 2nd UAT session, and the final combined checklist is signed by the authorised client representative.</w:t>
+        <w:t xml:space="preserve">Where all relevant items are marked Pass and this checklist is signed by the authorised client representative, the UAT acceptance milestone under the signed proposal is treated as achieved.</w:t>
       </w:r>
     </w:p>
     <w:p>
@@ -2767,7 +2861,7 @@
         <w:t xml:space="preserve"> </w:t>
       </w:r>
       <w:r>
-        <w:t xml:space="preserve">This checklist intentionally excludes internal test notes, screenshots and chat logs. The signed and annotated copy serves as the acceptance record for this round.</w:t>
+        <w:t xml:space="preserve">This checklist intentionally excludes internal test notes, screenshots and chat logs. The signed and annotated copy serves as the acceptance record.</w:t>
       </w:r>
     </w:p>
     <w:p>
@@ -2779,25 +2873,25 @@
           <w:b/>
           <w:bCs/>
         </w:rPr>
-        <w:t xml:space="preserve">Sign-off selection (1st UAT):</w:t>
+        <w:t xml:space="preserve">Sign-off selection:</w:t>
       </w:r>
       <w:r>
         <w:t xml:space="preserve"> </w:t>
       </w:r>
       <w:r>
-        <w:t xml:space="preserve">- [ ] Accepted — all items demonstrated this round marked Pass; no items carried to 2nd UAT.</w:t>
+        <w:t xml:space="preserve">- [ ] Accepted — all relevant items marked Pass.</w:t>
       </w:r>
       <w:r>
         <w:t xml:space="preserve"> </w:t>
       </w:r>
       <w:r>
-        <w:t xml:space="preserve">- [ ] Accepted with carry-forward — items demonstrated this round annotated above; remaining/failed items to be retested at the 2nd UAT session.</w:t>
+        <w:t xml:space="preserve">- [ ] Accepted with exceptions — failed / deferred items annotated above.</w:t>
       </w:r>
       <w:r>
         <w:t xml:space="preserve"> </w:t>
       </w:r>
       <w:r>
-        <w:t xml:space="preserve">- [ ] Not accepted — retest required before this round can be considered complete.</w:t>
+        <w:t xml:space="preserve">- [ ] Not accepted — retest required before UAT sign-off.</w:t>
       </w:r>
     </w:p>
     <w:p>

</xml_diff>